<commit_message>
fix(build): disable cloudflare plugin and update layout maps for vercel
</commit_message>
<xml_diff>
--- a/제출서류/(참가신청서+및+기획서)「2026년+산림+공공데이터·AI+활용+창업경진대회」_작성완료.docx
+++ b/제출서류/(참가신청서+및+기획서)「2026년+산림+공공데이터·AI+활용+창업경진대회」_작성완료.docx
@@ -2914,7 +2914,7 @@
                 </mc:Choice>
                 <mc:Fallback>
                   <w:pict>
-                    <v:shapetype w14:anchorId="241FF3FE" id="_x0000_t75" coordsize="21600,21600" o:spt="75" o:preferrelative="t" path="m@4@5l@4@11@9@11@9@5xe" filled="f" stroked="f">
+                    <v:shapetype w14:anchorId="10B1F99C" id="_x0000_t75" coordsize="21600,21600" o:spt="75" o:preferrelative="t" path="m@4@5l@4@11@9@11@9@5xe" filled="f" stroked="f">
                       <v:stroke joinstyle="miter"/>
                       <v:formulas>
                         <v:f eqn="if lineDrawn pixelLineWidth 0"/>
@@ -5496,7 +5496,7 @@
                 </mc:Choice>
                 <mc:Fallback>
                   <w:pict>
-                    <v:shape w14:anchorId="2FAEBB7C" id="잉크 8" o:spid="_x0000_s1026" type="#_x0000_t75" style="position:absolute;margin-left:444.75pt;margin-top:-9.35pt;width:27.85pt;height:31.8pt;z-index:251660288;visibility:visible;mso-wrap-style:square;mso-wrap-distance-left:9pt;mso-wrap-distance-top:0;mso-wrap-distance-right:9pt;mso-wrap-distance-bottom:0;mso-position-horizontal:absolute;mso-position-horizontal-relative:text;mso-position-vertical:absolute;mso-position-vertical-relative:text" o:gfxdata="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">
+                    <v:shape w14:anchorId="09A0F44F" id="잉크 8" o:spid="_x0000_s1026" type="#_x0000_t75" style="position:absolute;margin-left:444.75pt;margin-top:-9.35pt;width:27.85pt;height:31.8pt;z-index:251660288;visibility:visible;mso-wrap-style:square;mso-wrap-distance-left:9pt;mso-wrap-distance-top:0;mso-wrap-distance-right:9pt;mso-wrap-distance-bottom:0;mso-position-horizontal:absolute;mso-position-horizontal-relative:text;mso-position-vertical:absolute;mso-position-vertical-relative:text" o:gfxdata="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">
                       <v:imagedata r:id="rId10" o:title=""/>
                     </v:shape>
                   </w:pict>
@@ -7012,7 +7012,7 @@
                 </mc:Choice>
                 <mc:Fallback>
                   <w:pict>
-                    <v:shape w14:anchorId="4F3EB340" id="잉크 9" o:spid="_x0000_s1026" type="#_x0000_t75" style="position:absolute;margin-left:431.2pt;margin-top:15.1pt;width:44.9pt;height:40.15pt;z-index:251661312;visibility:visible;mso-wrap-style:square;mso-wrap-distance-left:9pt;mso-wrap-distance-top:0;mso-wrap-distance-right:9pt;mso-wrap-distance-bottom:0;mso-position-horizontal:absolute;mso-position-horizontal-relative:text;mso-position-vertical:absolute;mso-position-vertical-relative:text" o:gfxdata="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">
+                    <v:shape w14:anchorId="19A6164F" id="잉크 9" o:spid="_x0000_s1026" type="#_x0000_t75" style="position:absolute;margin-left:431.2pt;margin-top:15.1pt;width:44.9pt;height:40.15pt;z-index:251661312;visibility:visible;mso-wrap-style:square;mso-wrap-distance-left:9pt;mso-wrap-distance-top:0;mso-wrap-distance-right:9pt;mso-wrap-distance-bottom:0;mso-position-horizontal:absolute;mso-position-horizontal-relative:text;mso-position-vertical:absolute;mso-position-vertical-relative:text" o:gfxdata="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">
                       <v:imagedata r:id="rId12" o:title=""/>
                     </v:shape>
                   </w:pict>
@@ -8354,33 +8354,6 @@
                 <w:szCs w:val="24"/>
               </w:rPr>
             </w:pPr>
-            <w:r>
-              <w:rPr>
-                <w:rFonts w:ascii="굴림" w:eastAsia="굴림" w:cs="굴림"/>
-                <w:color w:val="A6A6A6"/>
-                <w:sz w:val="24"/>
-                <w:szCs w:val="24"/>
-              </w:rPr>
-              <w:t xml:space="preserve">(개발 진행 중 </w:t>
-            </w:r>
-            <w:r>
-              <w:rPr>
-                <w:rFonts w:ascii="굴림" w:eastAsia="굴림" w:cs="굴림"/>
-                <w:color w:val="A6A6A6"/>
-                <w:sz w:val="24"/>
-                <w:szCs w:val="24"/>
-              </w:rPr>
-              <w:t>—</w:t>
-            </w:r>
-            <w:r>
-              <w:rPr>
-                <w:rFonts w:ascii="굴림" w:eastAsia="굴림" w:cs="굴림"/>
-                <w:color w:val="A6A6A6"/>
-                <w:sz w:val="24"/>
-                <w:szCs w:val="24"/>
-              </w:rPr>
-              <w:t xml:space="preserve"> 배포 예정)</w:t>
-            </w:r>
           </w:p>
         </w:tc>
       </w:tr>
@@ -8453,34 +8426,41 @@
             <w:vAlign w:val="center"/>
           </w:tcPr>
           <w:p>
+            <w:r>
+              <w:rPr>
+                <w:rFonts w:hint="eastAsia"/>
+              </w:rPr>
+              <w:t xml:space="preserve">제품 작동영상 </w:t>
+            </w:r>
+            <w:proofErr w:type="gramStart"/>
+            <w:r>
+              <w:rPr>
+                <w:rFonts w:hint="eastAsia"/>
+              </w:rPr>
+              <w:t>링크 :</w:t>
+            </w:r>
+            <w:proofErr w:type="gramEnd"/>
+            <w:r>
+              <w:rPr>
+                <w:rFonts w:hint="eastAsia"/>
+              </w:rPr>
+              <w:t xml:space="preserve"> </w:t>
+            </w:r>
+            <w:r>
+              <w:t>https://drive.google.com/file/d/1teeYe8qwuxbZ62DsddnvD6bNs6jOnCtl/view?usp=sharing</w:t>
+            </w:r>
+          </w:p>
+          <w:p>
             <w:pPr>
               <w:pStyle w:val="a8"/>
               <w:spacing w:line="240" w:lineRule="auto"/>
               <w:rPr>
-                <w:rFonts w:ascii="굴림" w:eastAsia="굴림" w:cs="굴림"/>
+                <w:rFonts w:ascii="굴림" w:eastAsia="굴림" w:cs="굴림" w:hint="eastAsia"/>
                 <w:color w:val="A6A6A6"/>
                 <w:sz w:val="24"/>
                 <w:szCs w:val="24"/>
               </w:rPr>
             </w:pPr>
-            <w:r>
-              <w:rPr>
-                <w:rFonts w:ascii="굴림" w:eastAsia="굴림" w:cs="굴림"/>
-                <w:color w:val="A6A6A6"/>
-                <w:sz w:val="24"/>
-                <w:szCs w:val="24"/>
-              </w:rPr>
-              <w:t>※</w:t>
-            </w:r>
-            <w:r>
-              <w:rPr>
-                <w:rFonts w:ascii="굴림" w:eastAsia="굴림" w:cs="굴림"/>
-                <w:color w:val="A6A6A6"/>
-                <w:sz w:val="24"/>
-                <w:szCs w:val="24"/>
-              </w:rPr>
-              <w:t xml:space="preserve"> 기타 개발 제품 등을 확인할 수 있는 정보 기재</w:t>
-            </w:r>
           </w:p>
         </w:tc>
       </w:tr>
@@ -9022,6 +9002,7 @@
               <w:rPr>
                 <w:rFonts w:ascii="굴림" w:eastAsia="굴림" w:cs="굴림"/>
               </w:rPr>
+              <w:lastRenderedPageBreak/>
               <w:t>⑤</w:t>
             </w:r>
             <w:r>
@@ -9148,7 +9129,6 @@
               <w:rPr>
                 <w:rFonts w:ascii="굴림" w:eastAsia="굴림" w:cs="굴림"/>
               </w:rPr>
-              <w:lastRenderedPageBreak/>
               <w:br/>
             </w:r>
             <w:r>
@@ -10009,6 +9989,13 @@
                 <w:szCs w:val="22"/>
               </w:rPr>
               <w:br/>
+            </w:r>
+            <w:r>
+              <w:rPr>
+                <w:rFonts w:ascii="굴림" w:eastAsia="굴림" w:cs="굴림"/>
+                <w:szCs w:val="22"/>
+              </w:rPr>
+              <w:lastRenderedPageBreak/>
               <w:t xml:space="preserve">   - Supabase (PostgreSQL) 데이터베이스</w:t>
             </w:r>
             <w:r>
@@ -10054,13 +10041,6 @@
                 <w:szCs w:val="22"/>
               </w:rPr>
               <w:br/>
-            </w:r>
-            <w:r>
-              <w:rPr>
-                <w:rFonts w:ascii="굴림" w:eastAsia="굴림" w:cs="굴림"/>
-                <w:szCs w:val="22"/>
-              </w:rPr>
-              <w:lastRenderedPageBreak/>
               <w:t xml:space="preserve">   - Structured Output (JSON Schema 강제) 방식으로 일관된 추천 결과 생성</w:t>
             </w:r>
             <w:r>
@@ -10879,6 +10859,14 @@
                 <w:szCs w:val="22"/>
               </w:rPr>
               <w:br/>
+            </w:r>
+            <w:r>
+              <w:rPr>
+                <w:rFonts w:ascii="굴림" w:eastAsia="굴림" w:cs="굴림"/>
+                <w:spacing w:val="-2"/>
+                <w:szCs w:val="22"/>
+              </w:rPr>
+              <w:lastRenderedPageBreak/>
               <w:t xml:space="preserve">   - 정신건강 앱 시장: 글로벌 87억 달러 (2027년 전망, Allied Market Research)</w:t>
             </w:r>
             <w:r>
@@ -10952,7 +10940,6 @@
                 <w:spacing w:val="-2"/>
                 <w:szCs w:val="22"/>
               </w:rPr>
-              <w:lastRenderedPageBreak/>
               <w:br/>
               <w:t xml:space="preserve">1. B2C 프리미엄 구독 (월 </w:t>
             </w:r>
@@ -11635,6 +11622,13 @@
                 <w:szCs w:val="22"/>
               </w:rPr>
               <w:br/>
+            </w:r>
+            <w:r>
+              <w:rPr>
+                <w:rFonts w:ascii="굴림" w:eastAsia="굴림" w:cs="굴림"/>
+                <w:szCs w:val="22"/>
+              </w:rPr>
+              <w:lastRenderedPageBreak/>
               <w:t xml:space="preserve">   - 정보 탐색 시간 단축: 분산된 5개 이상 사이트 </w:t>
             </w:r>
             <w:r>
@@ -11708,13 +11702,6 @@
                 <w:szCs w:val="22"/>
               </w:rPr>
               <w:br/>
-            </w:r>
-            <w:r>
-              <w:rPr>
-                <w:rFonts w:ascii="굴림" w:eastAsia="굴림" w:cs="굴림"/>
-                <w:szCs w:val="22"/>
-              </w:rPr>
-              <w:lastRenderedPageBreak/>
               <w:t>3. 지역 경제 활성화</w:t>
             </w:r>
             <w:r>

</xml_diff>